<commit_message>
Add interactive dashboards and link them from the report packs
</commit_message>
<xml_diff>
--- a/assets/Lohan_De_Silva_CV.docx
+++ b/assets/Lohan_De_Silva_CV.docx
@@ -43,7 +43,7 @@
         </w:rPr>
         <w:t xml:space="preserve">Colombo, Sri Lanka  ·  +94 70 466 9834  ·  </w:t>
       </w:r>
-      <w:hyperlink w:history="1" r:id="rIdkkhs3q7kgwo8d2_8e82_z">
+      <w:hyperlink w:history="1" r:id="rIdmgmxmpmjmgee_fanfrwl6">
         <w:r>
           <w:rPr>
             <w:color w:val="1C4E80"/>
@@ -62,7 +62,7 @@
         </w:rPr>
         <w:t xml:space="preserve">  ·  </w:t>
       </w:r>
-      <w:hyperlink w:history="1" r:id="rIdfei7umsx11cwhx8hfd2_8">
+      <w:hyperlink w:history="1" r:id="rId6dltzegwr8bp_ln25giil">
         <w:r>
           <w:rPr>
             <w:color w:val="1C4E80"/>
@@ -81,7 +81,7 @@
         </w:rPr>
         <w:t xml:space="preserve">  ·  </w:t>
       </w:r>
-      <w:hyperlink w:history="1" r:id="rIdlx1prmkzk2yhsxypsfk0y">
+      <w:hyperlink w:history="1" r:id="rIdnbdvut8kkduxeawzck_cg">
         <w:r>
           <w:rPr>
             <w:color w:val="1C4E80"/>
@@ -233,7 +233,7 @@
           <w:sz w:val="19"/>
           <w:szCs w:val="19"/>
         </w:rPr>
-        <w:t xml:space="preserve">Tableau, Power BI, Power Query, DAX, dashboard design and measure specification</w:t>
+        <w:t xml:space="preserve">Interactive dashboard development, Tableau, Power BI, Power Query, DAX, KPI and measure specification</w:t>
       </w:r>
     </w:p>
     <w:p>
@@ -331,9 +331,9 @@
           <w:sz w:val="17"/>
           <w:szCs w:val="17"/>
         </w:rPr>
-        <w:t xml:space="preserve">  ·  Python · SQL · Tableau  ·  </w:t>
-      </w:r>
-      <w:hyperlink w:history="1" r:id="rIdbdfynnyd0qvv8ab7tlji-">
+        <w:t xml:space="preserve">  ·  Python · SQL · interactive dashboard  ·  </w:t>
+      </w:r>
+      <w:hyperlink w:history="1" r:id="rIdzrxald5d9ygjgy01r1sup">
         <w:r>
           <w:rPr>
             <w:color w:val="1C4E80"/>
@@ -524,9 +524,9 @@
           <w:sz w:val="17"/>
           <w:szCs w:val="17"/>
         </w:rPr>
-        <w:t xml:space="preserve">  ·  Python · SQL · Tableau  ·  </w:t>
-      </w:r>
-      <w:hyperlink w:history="1" r:id="rIdi1-hszkjmunhumqp9e8sn">
+        <w:t xml:space="preserve">  ·  Python · SQL · interactive dashboard  ·  </w:t>
+      </w:r>
+      <w:hyperlink w:history="1" r:id="rIdifqqox3hoi_v6liljptva">
         <w:r>
           <w:rPr>
             <w:color w:val="1C4E80"/>
@@ -702,9 +702,9 @@
           <w:sz w:val="17"/>
           <w:szCs w:val="17"/>
         </w:rPr>
-        <w:t xml:space="preserve">  ·  Python · SQL · Tableau  ·  </w:t>
-      </w:r>
-      <w:hyperlink w:history="1" r:id="rIdby7mshdf8b-p9gopvvguo">
+        <w:t xml:space="preserve">  ·  Python · SQL · interactive dashboard  ·  </w:t>
+      </w:r>
+      <w:hyperlink w:history="1" r:id="rIdabhlu_xnf3gat4yvu-vef">
         <w:r>
           <w:rPr>
             <w:color w:val="1C4E80"/>
@@ -862,9 +862,9 @@
           <w:sz w:val="17"/>
           <w:szCs w:val="17"/>
         </w:rPr>
-        <w:t xml:space="preserve">  ·  Python · SQL · Tableau  ·  </w:t>
-      </w:r>
-      <w:hyperlink w:history="1" r:id="rIdbscwibqcydmvrpjtszxw8">
+        <w:t xml:space="preserve">  ·  Python · SQL · interactive dashboard  ·  </w:t>
+      </w:r>
+      <w:hyperlink w:history="1" r:id="rIdnnt5rumaosev2jyddmlpk">
         <w:r>
           <w:rPr>
             <w:color w:val="1C4E80"/>
@@ -1058,9 +1058,9 @@
           <w:sz w:val="17"/>
           <w:szCs w:val="17"/>
         </w:rPr>
-        <w:t xml:space="preserve">  ·  Python · SQL · Tableau  ·  </w:t>
-      </w:r>
-      <w:hyperlink w:history="1" r:id="rId7jevcgzw4vh8hfdittmjy">
+        <w:t xml:space="preserve">  ·  Python · SQL · interactive dashboard  ·  </w:t>
+      </w:r>
+      <w:hyperlink w:history="1" r:id="rIduccw_rtm1q0394ucemk_w">
         <w:r>
           <w:rPr>
             <w:color w:val="1C4E80"/>
@@ -1853,7 +1853,7 @@
         </w:rPr>
         <w:t xml:space="preserve">Portfolio  </w:t>
       </w:r>
-      <w:hyperlink w:history="1" r:id="rIdufybwhtwaqcas5kpx5im5">
+      <w:hyperlink w:history="1" r:id="rIddidda2ltyza3aim99p_xc">
         <w:r>
           <w:rPr>
             <w:color w:val="1C4E80"/>

</xml_diff>

<commit_message>
Update CV and background section with revenue and campaign figures
</commit_message>
<xml_diff>
--- a/assets/Lohan_De_Silva_CV.docx
+++ b/assets/Lohan_De_Silva_CV.docx
@@ -43,7 +43,7 @@
         </w:rPr>
         <w:t xml:space="preserve">Colombo, Sri Lanka  ·  +94 70 466 9834  ·  </w:t>
       </w:r>
-      <w:hyperlink w:history="1" r:id="rIdmgmxmpmjmgee_fanfrwl6">
+      <w:hyperlink w:history="1" r:id="rIdc9hctsxren_wfrtb7tn3s">
         <w:r>
           <w:rPr>
             <w:color w:val="1C4E80"/>
@@ -62,7 +62,7 @@
         </w:rPr>
         <w:t xml:space="preserve">  ·  </w:t>
       </w:r>
-      <w:hyperlink w:history="1" r:id="rId6dltzegwr8bp_ln25giil">
+      <w:hyperlink w:history="1" r:id="rIdgrn2uexc5hwqlpqvoyenw">
         <w:r>
           <w:rPr>
             <w:color w:val="1C4E80"/>
@@ -81,7 +81,7 @@
         </w:rPr>
         <w:t xml:space="preserve">  ·  </w:t>
       </w:r>
-      <w:hyperlink w:history="1" r:id="rIdnbdvut8kkduxeawzck_cg">
+      <w:hyperlink w:history="1" r:id="rIdl9tvfbqsqnaqipilz9a6e">
         <w:r>
           <w:rPr>
             <w:color w:val="1C4E80"/>
@@ -130,7 +130,7 @@
           <w:sz w:val="19"/>
           <w:szCs w:val="19"/>
         </w:rPr>
-        <w:t xml:space="preserve">Business analyst with three years across enterprise technology, financial services and business development, working primarily in quantitative analysis. Builds analyses that end in a decision: five published projects spanning retention economics, pricing policy, credit risk, equity profitability and operational capacity, each carried through to a recommendation with a stated break-even and a fully reproducible pipeline. Comfortable owning a problem from requirements through SQL and Python to the dashboard and the memo that goes with it.</w:t>
+        <w:t xml:space="preserve">Business analyst with four years across enterprise technology, financial services and business development, working primarily in quantitative analysis. Builds analyses that end in a decision: five published projects spanning retention economics, pricing policy, credit risk, equity profitability and operational capacity, each carried through to a recommendation with a stated break-even and a fully reproducible pipeline. Comfortable owning a problem from requirements through SQL and Python to the dashboard and the memo that goes with it.</w:t>
       </w:r>
     </w:p>
     <w:p>
@@ -333,7 +333,7 @@
         </w:rPr>
         <w:t xml:space="preserve">  ·  Python · SQL · interactive dashboard  ·  </w:t>
       </w:r>
-      <w:hyperlink w:history="1" r:id="rIdzrxald5d9ygjgy01r1sup">
+      <w:hyperlink w:history="1" r:id="rIdzphzdqsy-rmbycyaecuec">
         <w:r>
           <w:rPr>
             <w:color w:val="1C4E80"/>
@@ -526,7 +526,7 @@
         </w:rPr>
         <w:t xml:space="preserve">  ·  Python · SQL · interactive dashboard  ·  </w:t>
       </w:r>
-      <w:hyperlink w:history="1" r:id="rIdifqqox3hoi_v6liljptva">
+      <w:hyperlink w:history="1" r:id="rIdb4y_nkjpcjaa8i99yopha">
         <w:r>
           <w:rPr>
             <w:color w:val="1C4E80"/>
@@ -704,7 +704,7 @@
         </w:rPr>
         <w:t xml:space="preserve">  ·  Python · SQL · interactive dashboard  ·  </w:t>
       </w:r>
-      <w:hyperlink w:history="1" r:id="rIdabhlu_xnf3gat4yvu-vef">
+      <w:hyperlink w:history="1" r:id="rIdymr9mjzhvzd-o0x95w0ur">
         <w:r>
           <w:rPr>
             <w:color w:val="1C4E80"/>
@@ -864,7 +864,7 @@
         </w:rPr>
         <w:t xml:space="preserve">  ·  Python · SQL · interactive dashboard  ·  </w:t>
       </w:r>
-      <w:hyperlink w:history="1" r:id="rIdnnt5rumaosev2jyddmlpk">
+      <w:hyperlink w:history="1" r:id="rIdgerxet1u79s25iukle2q9">
         <w:r>
           <w:rPr>
             <w:color w:val="1C4E80"/>
@@ -1060,7 +1060,7 @@
         </w:rPr>
         <w:t xml:space="preserve">  ·  Python · SQL · interactive dashboard  ·  </w:t>
       </w:r>
-      <w:hyperlink w:history="1" r:id="rIduccw_rtm1q0394ucemk_w">
+      <w:hyperlink w:history="1" r:id="rIdqw87tzax1ve--ei3mzetb">
         <w:r>
           <w:rPr>
             <w:color w:val="1C4E80"/>
@@ -1350,6 +1350,52 @@
       </w:pPr>
       <w:r>
         <w:rPr>
+          <w:b/>
+          <w:bCs/>
+          <w:color w:val="1A1A1A"/>
+          <w:sz w:val="19"/>
+          <w:szCs w:val="19"/>
+        </w:rPr>
+        <w:t xml:space="preserve">Closed LKR 26M of software revenue across four months</w:t>
+      </w:r>
+      <w:r>
+        <w:rPr>
+          <w:color w:val="1A1A1A"/>
+          <w:sz w:val="19"/>
+          <w:szCs w:val="19"/>
+        </w:rPr>
+        <w:t xml:space="preserve">, growing monthly closed revenue from LKR 4M to LKR 11M — a </w:t>
+      </w:r>
+      <w:r>
+        <w:rPr>
+          <w:b/>
+          <w:bCs/>
+          <w:color w:val="1A1A1A"/>
+          <w:sz w:val="19"/>
+          <w:szCs w:val="19"/>
+        </w:rPr>
+        <w:t xml:space="preserve">2.75x increase</w:t>
+      </w:r>
+      <w:r>
+        <w:rPr>
+          <w:color w:val="1A1A1A"/>
+          <w:sz w:val="19"/>
+          <w:szCs w:val="19"/>
+        </w:rPr>
+        <w:t xml:space="preserve"> over the period.</w:t>
+      </w:r>
+    </w:p>
+    <w:p>
+      <w:pPr>
+        <w:pStyle w:val="ListParagraph"/>
+        <w:numPr>
+          <w:ilvl w:val="0"/>
+          <w:numId w:val="2"/>
+        </w:numPr>
+        <w:spacing w:after="26" w:line="232"/>
+      </w:pPr>
+      <w:r>
+        <w:rPr>
           <w:color w:val="1A1A1A"/>
           <w:sz w:val="19"/>
           <w:szCs w:val="19"/>
@@ -1438,11 +1484,39 @@
       </w:pPr>
       <w:r>
         <w:rPr>
-          <w:color w:val="1A1A1A"/>
-          <w:sz w:val="19"/>
-          <w:szCs w:val="19"/>
-        </w:rPr>
-        <w:t xml:space="preserve">Managed customer acquisition for the consumer banking portfolio across an assigned territory, consistently meeting or exceeding assigned targets.</w:t>
+          <w:b/>
+          <w:bCs/>
+          <w:color w:val="1A1A1A"/>
+          <w:sz w:val="19"/>
+          <w:szCs w:val="19"/>
+        </w:rPr>
+        <w:t xml:space="preserve">Organised five promotional campaigns</w:t>
+      </w:r>
+      <w:r>
+        <w:rPr>
+          <w:color w:val="1A1A1A"/>
+          <w:sz w:val="19"/>
+          <w:szCs w:val="19"/>
+        </w:rPr>
+        <w:t xml:space="preserve"> with merchant partners across the assigned territory, selling </w:t>
+      </w:r>
+      <w:r>
+        <w:rPr>
+          <w:b/>
+          <w:bCs/>
+          <w:color w:val="1A1A1A"/>
+          <w:sz w:val="19"/>
+          <w:szCs w:val="19"/>
+        </w:rPr>
+        <w:t xml:space="preserve">50+ credit cards</w:t>
+      </w:r>
+      <w:r>
+        <w:rPr>
+          <w:color w:val="1A1A1A"/>
+          <w:sz w:val="19"/>
+          <w:szCs w:val="19"/>
+        </w:rPr>
+        <w:t xml:space="preserve"> into the consumer banking portfolio.</w:t>
       </w:r>
     </w:p>
     <w:p>
@@ -1478,7 +1552,7 @@
           <w:sz w:val="19"/>
           <w:szCs w:val="19"/>
         </w:rPr>
-        <w:t xml:space="preserve">Worked with merchant partners on promotional initiatives supporting portfolio growth, within the bank's regulatory and conduct requirements.</w:t>
+        <w:t xml:space="preserve">Maintained client relationships throughout, within the bank's regulatory and conduct requirements.</w:t>
       </w:r>
     </w:p>
     <w:p>
@@ -1603,15 +1677,15 @@
           <w:sz w:val="19"/>
           <w:szCs w:val="19"/>
         </w:rPr>
-        <w:t xml:space="preserve">MSc Data Science</w:t>
-      </w:r>
-      <w:r>
-        <w:rPr>
-          <w:color w:val="1A1A1A"/>
-          <w:sz w:val="19"/>
-          <w:szCs w:val="19"/>
-        </w:rPr>
-        <w:t xml:space="preserve">  ·  University of Central Lancashire</w:t>
+        <w:t xml:space="preserve">BSc (Hons) Business Management with International Business</w:t>
+      </w:r>
+      <w:r>
+        <w:rPr>
+          <w:color w:val="1A1A1A"/>
+          <w:sz w:val="19"/>
+          <w:szCs w:val="19"/>
+        </w:rPr>
+        <w:t xml:space="preserve">  ·  Queen Margaret University, UK</w:t>
       </w:r>
       <w:r>
         <w:rPr>
@@ -1619,7 +1693,20 @@
           <w:sz w:val="17"/>
           <w:szCs w:val="17"/>
         </w:rPr>
-        <w:t xml:space="preserve">	2026 – Present</w:t>
+        <w:t xml:space="preserve">	2024 – 2026</w:t>
+      </w:r>
+    </w:p>
+    <w:p>
+      <w:pPr>
+        <w:spacing w:after="40"/>
+      </w:pPr>
+      <w:r>
+        <w:rPr>
+          <w:color w:val="555555"/>
+          <w:sz w:val="17"/>
+          <w:szCs w:val="17"/>
+        </w:rPr>
+        <w:t xml:space="preserve">Upper second-class honours (2:1)</w:t>
       </w:r>
     </w:p>
     <w:p>
@@ -1637,15 +1724,15 @@
           <w:sz w:val="19"/>
           <w:szCs w:val="19"/>
         </w:rPr>
-        <w:t xml:space="preserve">BSc (Hons) Business Administration, International Business</w:t>
-      </w:r>
-      <w:r>
-        <w:rPr>
-          <w:color w:val="1A1A1A"/>
-          <w:sz w:val="19"/>
-          <w:szCs w:val="19"/>
-        </w:rPr>
-        <w:t xml:space="preserve">  ·  Queen Margaret University, UK</w:t>
+        <w:t xml:space="preserve">Institute of Bankers of Sri Lanka</w:t>
+      </w:r>
+      <w:r>
+        <w:rPr>
+          <w:color w:val="1A1A1A"/>
+          <w:sz w:val="19"/>
+          <w:szCs w:val="19"/>
+        </w:rPr>
+        <w:t xml:space="preserve">  ·  Banking and financial services qualification</w:t>
       </w:r>
       <w:r>
         <w:rPr>
@@ -1653,21 +1740,7 @@
           <w:sz w:val="17"/>
           <w:szCs w:val="17"/>
         </w:rPr>
-        <w:t xml:space="preserve">	2023 – 2026</w:t>
-      </w:r>
-    </w:p>
-    <w:p>
-      <w:pPr>
-        <w:spacing w:after="40"/>
-        <w:ind w:left="0"/>
-      </w:pPr>
-      <w:r>
-        <w:rPr>
-          <w:color w:val="555555"/>
-          <w:sz w:val="17"/>
-          <w:szCs w:val="17"/>
-        </w:rPr>
-        <w:t xml:space="preserve">Upper second-class honours (2:1)</w:t>
+        <w:t xml:space="preserve">	Oct 2023 – Feb 2024</w:t>
       </w:r>
     </w:p>
     <w:p>
@@ -1685,7 +1758,7 @@
           <w:sz w:val="19"/>
           <w:szCs w:val="19"/>
         </w:rPr>
-        <w:t xml:space="preserve">G.C.E. Advanced Level and Ordinary Level</w:t>
+        <w:t xml:space="preserve">G.C.E. Advanced Level</w:t>
       </w:r>
       <w:r>
         <w:rPr>
@@ -1701,7 +1774,20 @@
           <w:sz w:val="17"/>
           <w:szCs w:val="17"/>
         </w:rPr>
-        <w:t xml:space="preserve">	2009 – 2023</w:t>
+        <w:t xml:space="preserve">	</w:t>
+      </w:r>
+    </w:p>
+    <w:p>
+      <w:pPr>
+        <w:spacing w:after="40"/>
+      </w:pPr>
+      <w:r>
+        <w:rPr>
+          <w:color w:val="555555"/>
+          <w:sz w:val="17"/>
+          <w:szCs w:val="17"/>
+        </w:rPr>
+        <w:t xml:space="preserve">Physical science stream</w:t>
       </w:r>
     </w:p>
     <w:p>
@@ -1738,25 +1824,7 @@
           <w:sz w:val="19"/>
           <w:szCs w:val="19"/>
         </w:rPr>
-        <w:t xml:space="preserve">IBM Data Analytics Professional Certificate, 2026</w:t>
-      </w:r>
-    </w:p>
-    <w:p>
-      <w:pPr>
-        <w:pStyle w:val="ListParagraph"/>
-        <w:numPr>
-          <w:ilvl w:val="0"/>
-          <w:numId w:val="2"/>
-        </w:numPr>
-        <w:spacing w:after="26" w:line="232"/>
-      </w:pPr>
-      <w:r>
-        <w:rPr>
-          <w:color w:val="1A1A1A"/>
-          <w:sz w:val="19"/>
-          <w:szCs w:val="19"/>
-        </w:rPr>
-        <w:t xml:space="preserve">Institute of Bankers of Sri Lanka (IBSL) qualification, 2024</w:t>
+        <w:t xml:space="preserve">IBM Data Analyst Professional Certificate</w:t>
       </w:r>
     </w:p>
     <w:p>
@@ -1823,37 +1891,9 @@
           <w:sz w:val="19"/>
           <w:szCs w:val="19"/>
         </w:rPr>
-        <w:t xml:space="preserve">Work authorisation  </w:t>
-      </w:r>
-      <w:r>
-        <w:rPr>
-          <w:color w:val="1A1A1A"/>
-          <w:sz w:val="19"/>
-          <w:szCs w:val="19"/>
-        </w:rPr>
-        <w:t xml:space="preserve">Eligible to work internationally</w:t>
-      </w:r>
-    </w:p>
-    <w:p>
-      <w:pPr>
-        <w:pStyle w:val="ListParagraph"/>
-        <w:numPr>
-          <w:ilvl w:val="0"/>
-          <w:numId w:val="2"/>
-        </w:numPr>
-        <w:spacing w:after="26" w:line="232"/>
-      </w:pPr>
-      <w:r>
-        <w:rPr>
-          <w:b/>
-          <w:bCs/>
-          <w:color w:val="1A1A1A"/>
-          <w:sz w:val="19"/>
-          <w:szCs w:val="19"/>
-        </w:rPr>
         <w:t xml:space="preserve">Portfolio  </w:t>
       </w:r>
-      <w:hyperlink w:history="1" r:id="rIddidda2ltyza3aim99p_xc">
+      <w:hyperlink w:history="1" r:id="rIdi6r-dh7fhehfovad9okdt">
         <w:r>
           <w:rPr>
             <w:color w:val="1C4E80"/>

</xml_diff>